<commit_message>
Ajusta informe de José: puntajes por comprensión demostrada y teórica 16/20
Co-Authored-By: Claude Opus 5.5 <noreply@anthropic.com>
Claude-Session: https://claude.ai/code/session_01XoDZLsg3S6BNvJBdoo6Rq7
</commit_message>
<xml_diff>
--- a/informes/Informe_entrevista_Jose.docx
+++ b/informes/Informe_entrevista_Jose.docx
@@ -981,8 +981,11 @@
             <w:r>
               <w:rPr>
                 <w:rFonts w:ascii="Roboto Slab" w:eastAsia="Roboto Slab" w:hAnsi="Roboto Slab" w:cs="Roboto Slab"/>
-              </w:rPr>
-              <w:t xml:space="preserve">Por definir</w:t>
+                <w:b/>
+                <w:bCs/>
+                <w:color w:val="C00000"/>
+              </w:rPr>
+              <w:t xml:space="preserve">NO</w:t>
             </w:r>
           </w:p>
         </w:tc>
@@ -1515,11 +1518,11 @@
                 <w:rFonts w:ascii="Segoe UI" w:hAnsi="Segoe UI" w:cs="Segoe UI"/>
                 <w:b/>
                 <w:bCs/>
-                <w:color w:val="1F3864"/>
+                <w:color w:val="C00000"/>
                 <w:sz w:val="22"/>
                 <w:szCs w:val="22"/>
               </w:rPr>
-              <w:t xml:space="preserve">PRÁCTICA 51/100 – NOTA FINAL PENDIENTE</w:t>
+              <w:t xml:space="preserve">NO APROBADO</w:t>
             </w:r>
           </w:p>
         </w:tc>
@@ -1885,7 +1888,7 @@
           <w:sz w:val="20"/>
           <w:szCs w:val="20"/>
         </w:rPr>
-        <w:t xml:space="preserve">La prueba práctica suma 51/100 (diseño 11/20, implementación 24/40, defensa 16/40). El código entregado resuelve la mayoría de los riesgos del caso: reglas deterministas, registro idempotente, manejo de ambigüedad con sesiones, enmascarado de la tarjeta y detección de inyección en datos del proveedor. Sin embargo, la demostración no funcionó y en la defensa el candidato describió su solución por debajo de lo que el código implementa, y en varios puntos de forma contraria a él (estado, ubicación de las reglas, reintentos, protección contra inyección). La nota final queda pendiente de la evaluación teórica.</w:t>
+        <w:t xml:space="preserve">Obtuvo 16/20 en la prueba teórica y 44/100 en la práctica (diseño 10/20, implementación 19/40, defensa 15/40), con una nota final de 4,94 sobre 10. El código, generado con IA en el tiempo de la prueba, incluye controles relevantes para el caso: reglas deterministas, registro idempotente, sesiones, enmascarado de la tarjeta y detección de inyección. Sin embargo, la demostración no funcionó y en la defensa el candidato no identificó qué cubría su solución: describió como ausentes componentes que el código sí tiene (estado, reintentos, protección contra inyección) y ubicó las reglas en un lugar distinto al real. La evaluación considera las decisiones que el candidato demostró entender, no solo el código generado.</w:t>
       </w:r>
     </w:p>
     <w:p>
@@ -2096,7 +2099,7 @@
                 <w:sz w:val="19"/>
                 <w:szCs w:val="19"/>
               </w:rPr>
-              <w:t xml:space="preserve">[Por completar]</w:t>
+              <w:t xml:space="preserve">16 / 20</w:t>
             </w:r>
           </w:p>
         </w:tc>
@@ -2116,7 +2119,7 @@
                 <w:sz w:val="19"/>
                 <w:szCs w:val="19"/>
               </w:rPr>
-              <w:t xml:space="preserve">—</w:t>
+              <w:t xml:space="preserve">8,00</w:t>
             </w:r>
           </w:p>
         </w:tc>
@@ -2161,7 +2164,7 @@
                 <w:sz w:val="19"/>
                 <w:szCs w:val="19"/>
               </w:rPr>
-              <w:t xml:space="preserve">11 / 20</w:t>
+              <w:t xml:space="preserve">10 / 20</w:t>
             </w:r>
           </w:p>
         </w:tc>
@@ -2181,7 +2184,7 @@
                 <w:sz w:val="19"/>
                 <w:szCs w:val="19"/>
               </w:rPr>
-              <w:t xml:space="preserve">5,50</w:t>
+              <w:t xml:space="preserve">5,00</w:t>
             </w:r>
           </w:p>
         </w:tc>
@@ -2226,7 +2229,7 @@
                 <w:sz w:val="19"/>
                 <w:szCs w:val="19"/>
               </w:rPr>
-              <w:t xml:space="preserve">24 / 40</w:t>
+              <w:t xml:space="preserve">19 / 40</w:t>
             </w:r>
           </w:p>
         </w:tc>
@@ -2246,7 +2249,7 @@
                 <w:sz w:val="19"/>
                 <w:szCs w:val="19"/>
               </w:rPr>
-              <w:t xml:space="preserve">6,00</w:t>
+              <w:t xml:space="preserve">4,75</w:t>
             </w:r>
           </w:p>
         </w:tc>
@@ -2291,7 +2294,7 @@
                 <w:sz w:val="19"/>
                 <w:szCs w:val="19"/>
               </w:rPr>
-              <w:t xml:space="preserve">16 / 40</w:t>
+              <w:t xml:space="preserve">15 / 40</w:t>
             </w:r>
           </w:p>
         </w:tc>
@@ -2311,7 +2314,7 @@
                 <w:sz w:val="19"/>
                 <w:szCs w:val="19"/>
               </w:rPr>
-              <w:t xml:space="preserve">4,00</w:t>
+              <w:t xml:space="preserve">3,75</w:t>
             </w:r>
           </w:p>
         </w:tc>
@@ -2362,7 +2365,7 @@
                 <w:sz w:val="19"/>
                 <w:szCs w:val="19"/>
               </w:rPr>
-              <w:t xml:space="preserve">51 / 100</w:t>
+              <w:t xml:space="preserve">44 / 100</w:t>
             </w:r>
           </w:p>
         </w:tc>
@@ -2385,7 +2388,7 @@
                 <w:sz w:val="19"/>
                 <w:szCs w:val="19"/>
               </w:rPr>
-              <w:t xml:space="preserve">5,10</w:t>
+              <w:t xml:space="preserve">4,40</w:t>
             </w:r>
           </w:p>
         </w:tc>
@@ -2413,7 +2416,7 @@
                 <w:sz w:val="19"/>
                 <w:szCs w:val="19"/>
               </w:rPr>
-              <w:t xml:space="preserve">Nota final (teórica + práctica)</w:t>
+              <w:t xml:space="preserve">Nota final (15 % teórica + 85 % práctica)</w:t>
             </w:r>
           </w:p>
         </w:tc>
@@ -2436,7 +2439,7 @@
                 <w:sz w:val="19"/>
                 <w:szCs w:val="19"/>
               </w:rPr>
-              <w:t xml:space="preserve">Pendiente</w:t>
+              <w:t xml:space="preserve">—</w:t>
             </w:r>
           </w:p>
         </w:tc>
@@ -2459,7 +2462,7 @@
                 <w:sz w:val="19"/>
                 <w:szCs w:val="19"/>
               </w:rPr>
-              <w:t xml:space="preserve">—</w:t>
+              <w:t xml:space="preserve">4,94</w:t>
             </w:r>
           </w:p>
         </w:tc>
@@ -2702,7 +2705,7 @@
                 <w:sz w:val="19"/>
                 <w:szCs w:val="19"/>
               </w:rPr>
-              <w:t xml:space="preserve">5 / 8</w:t>
+              <w:t xml:space="preserve">4 / 8</w:t>
             </w:r>
           </w:p>
         </w:tc>
@@ -2840,7 +2843,7 @@
                 <w:sz w:val="19"/>
                 <w:szCs w:val="19"/>
               </w:rPr>
-              <w:t xml:space="preserve">11 / 20</w:t>
+              <w:t xml:space="preserve">10 / 20</w:t>
             </w:r>
           </w:p>
         </w:tc>
@@ -3104,7 +3107,7 @@
                 <w:sz w:val="19"/>
                 <w:szCs w:val="19"/>
               </w:rPr>
-              <w:t xml:space="preserve">7 / 8</w:t>
+              <w:t xml:space="preserve">5 / 8</w:t>
             </w:r>
           </w:p>
         </w:tc>
@@ -3170,7 +3173,7 @@
                 <w:sz w:val="19"/>
                 <w:szCs w:val="19"/>
               </w:rPr>
-              <w:t xml:space="preserve">4 / 6</w:t>
+              <w:t xml:space="preserve">3 / 6</w:t>
             </w:r>
           </w:p>
         </w:tc>
@@ -3302,7 +3305,7 @@
                 <w:sz w:val="19"/>
                 <w:szCs w:val="19"/>
               </w:rPr>
-              <w:t xml:space="preserve">4 / 6</w:t>
+              <w:t xml:space="preserve">2 / 6</w:t>
             </w:r>
           </w:p>
         </w:tc>
@@ -3374,7 +3377,7 @@
                 <w:sz w:val="19"/>
                 <w:szCs w:val="19"/>
               </w:rPr>
-              <w:t xml:space="preserve">24 / 40</w:t>
+              <w:t xml:space="preserve">19 / 40</w:t>
             </w:r>
           </w:p>
         </w:tc>
@@ -3506,7 +3509,7 @@
                 <w:sz w:val="19"/>
                 <w:szCs w:val="19"/>
               </w:rPr>
-              <w:t xml:space="preserve">3 / 8</w:t>
+              <w:t xml:space="preserve">2 / 8</w:t>
             </w:r>
           </w:p>
         </w:tc>
@@ -3776,7 +3779,7 @@
                 <w:sz w:val="19"/>
                 <w:szCs w:val="19"/>
               </w:rPr>
-              <w:t xml:space="preserve">16 / 40</w:t>
+              <w:t xml:space="preserve">15 / 40</w:t>
             </w:r>
           </w:p>
         </w:tc>
@@ -3803,7 +3806,7 @@
           <w:sz w:val="22"/>
           <w:szCs w:val="22"/>
         </w:rPr>
-        <w:t xml:space="preserve">Diseño de arquitectura: 11 / 20</w:t>
+        <w:t xml:space="preserve">Diseño de arquitectura: 10 / 20</w:t>
       </w:r>
     </w:p>
     <w:p>
@@ -3843,7 +3846,7 @@
           <w:sz w:val="20"/>
           <w:szCs w:val="20"/>
         </w:rPr>
-        <w:t xml:space="preserve">Aplicabilidad al escenario (5/8). </w:t>
+        <w:t xml:space="preserve">Aplicabilidad al escenario (4/8). </w:t>
       </w:r>
       <w:r>
         <w:rPr>
@@ -3851,7 +3854,7 @@
           <w:sz w:val="20"/>
           <w:szCs w:val="20"/>
         </w:rPr>
-        <w:t xml:space="preserve">El diseño cubre el flujo del caso y su plantilla de infraestructura (AWS SAM) incluye API Gateway, Lambda, DynamoDB, SQS, SNS y S3. La decisión de que el reglamento viva en un documento versionado responde bien a que Legal lo actualiza varias veces al año.</w:t>
+        <w:t xml:space="preserve">El diseño cubre el flujo del caso y la plantilla de infraestructura (AWS SAM) incluye API Gateway, Lambda, DynamoDB, SQS, SNS y S3. En la defensa sostuvo que las reglas del reglamento debían resolverse con RAG para no tenerlas en el código; para umbrales como plazos y montos, que deben aplicarse siempre igual, esa decisión deja la regla en manos de la interpretación del modelo.</w:t>
       </w:r>
     </w:p>
     <w:p>
@@ -3893,7 +3896,7 @@
           <w:sz w:val="22"/>
           <w:szCs w:val="22"/>
         </w:rPr>
-        <w:t xml:space="preserve">Implementación: 24 / 40</w:t>
+        <w:t xml:space="preserve">Implementación: 19 / 40</w:t>
       </w:r>
     </w:p>
     <w:p>
@@ -3981,7 +3984,7 @@
           <w:sz w:val="20"/>
           <w:szCs w:val="20"/>
         </w:rPr>
-        <w:t xml:space="preserve">Capa de agente (7/8). </w:t>
+        <w:t xml:space="preserve">Capa de agente (5/8). </w:t>
       </w:r>
       <w:r>
         <w:rPr>
@@ -3989,7 +3992,7 @@
           <w:sz w:val="20"/>
           <w:szCs w:val="20"/>
         </w:rPr>
-        <w:t xml:space="preserve">El modelo conduce la conversación y usa herramientas, pero un guard determinista evalúa plazo, estado pendiente, monto, frecuencia de reclamos y suscripciones antes de registrar, y el orquestador rechaza una respuesta final que contradiga una regla; si el modelo insiste, responde desde la regla. Las sesiones guardan el historial y las transacciones candidatas, lo que permite aclarar la ambigüedad entre dos cobros. El número de tarjeta se enmascara antes de llegar al modelo.</w:t>
+        <w:t xml:space="preserve">El código generado incluye que el modelo conduzca la conversación con herramientas mientras un guard determinista evalúa plazo, estado pendiente, monto, frecuencia de reclamos y suscripciones antes de registrar, y el orquestador rechaza una respuesta final que contradiga una regla; si el modelo insiste, responde desde la regla. Las sesiones guardan el historial y las transacciones candidatas, lo que permite aclarar la ambigüedad entre dos cobros, y la tarjeta se enmascara antes del modelo. El candidato no reconoció estos mecanismos como parte de su solución: afirmó que no había manejo de estado.</w:t>
       </w:r>
     </w:p>
     <w:p>
@@ -4005,7 +4008,7 @@
           <w:sz w:val="20"/>
           <w:szCs w:val="20"/>
         </w:rPr>
-        <w:t xml:space="preserve">Capa de integración (4/6). </w:t>
+        <w:t xml:space="preserve">Capa de integración (3/6). </w:t>
       </w:r>
       <w:r>
         <w:rPr>
@@ -4013,7 +4016,7 @@
           <w:sz w:val="20"/>
           <w:szCs w:val="20"/>
         </w:rPr>
-        <w:t xml:space="preserve">El registro en el sistema legado es idempotente: evita duplicados por transacción, responde “en proceso” si se supera el timeout y solo reintenta cuando el legado devolvió error. La descripción del comercio se revisa con un detector de inyección. Los umbrales se leen del encabezado del reglamento versionado. El cliente del modelo está atado a Anthropic, sin adaptador para otros proveedores.</w:t>
+        <w:t xml:space="preserve">El código registra en el sistema legado de forma idempotente: evita duplicados por transacción, responde “en proceso” si se supera el timeout y solo reintenta cuando el legado devolvió error. La descripción del comercio se revisa con un detector de inyección. Los umbrales se leen del encabezado del reglamento versionado. El candidato indicó que no implementó reintentos, por lo que no conocía cómo se comporta esta integración. El cliente del modelo está atado a Anthropic, sin adaptador para otros proveedores.</w:t>
       </w:r>
     </w:p>
     <w:p>
@@ -4053,7 +4056,7 @@
           <w:sz w:val="20"/>
           <w:szCs w:val="20"/>
         </w:rPr>
-        <w:t xml:space="preserve">Generación del código (4/6). </w:t>
+        <w:t xml:space="preserve">Generación del código (2/6). </w:t>
       </w:r>
       <w:r>
         <w:rPr>
@@ -4061,7 +4064,7 @@
           <w:sz w:val="20"/>
           <w:szCs w:val="20"/>
         </w:rPr>
-        <w:t xml:space="preserve">Incluye 43 pruebas (reglas, idempotencia, orquestador, soporte) y escenarios para ejecutar contra el modelo real. El código llegó en un solo commit grande, y el candidato no logró ubicar en la defensa varias de sus partes.</w:t>
+        <w:t xml:space="preserve">El código se generó con IA y llegó en un solo commit de unas 2.300 líneas, con 43 pruebas. No se revisó lo suficiente para saber qué cubría: el candidato no logró ubicar varias de sus partes y la demostración no funcionó.</w:t>
       </w:r>
     </w:p>
     <w:p>
@@ -4079,7 +4082,7 @@
           <w:sz w:val="22"/>
           <w:szCs w:val="22"/>
         </w:rPr>
-        <w:t xml:space="preserve">Defensa: 16 / 40</w:t>
+        <w:t xml:space="preserve">Defensa: 15 / 40</w:t>
       </w:r>
     </w:p>
     <w:p>
@@ -4119,7 +4122,7 @@
           <w:sz w:val="20"/>
           <w:szCs w:val="20"/>
         </w:rPr>
-        <w:t xml:space="preserve">Decisiones de código e IA (3/8). </w:t>
+        <w:t xml:space="preserve">Decisiones de código e IA (2/8). </w:t>
       </w:r>
       <w:r>
         <w:rPr>
@@ -4227,7 +4230,7 @@
           <w:sz w:val="20"/>
           <w:szCs w:val="20"/>
         </w:rPr>
-        <w:t xml:space="preserve">La continuidad depende de la nota teórica, ya que la práctica suma 51/100. El código entregado resuelve con criterio los riesgos principales del caso, pero el candidato no pudo demostrarlo funcionando ni explicarlo: describió como ausentes componentes que sí están y ubicó las reglas en un lugar distinto al real. Esa distancia entre el código y la defensa impide confirmar que el diseño sea de su autoría o que lo domine.</w:t>
+        <w:t xml:space="preserve">No se recomienda continuar en el proceso. La nota final es 4,94 sobre 10. Usar IA para generar el código es válido, pero el candidato debe saber qué cubre su solución y qué no. En este caso no pudo demostrarla funcionando ni explicarla: describió como ausentes componentes que sí están y ubicó las reglas en un lugar distinto al real.</w:t>
       </w:r>
     </w:p>
     <w:p>
@@ -4241,11 +4244,12 @@
           <w:sz w:val="20"/>
           <w:szCs w:val="20"/>
         </w:rPr>
-        <w:t xml:space="preserve">Si avanza, conviene una sesión técnica adicional en la que modifique su propio código en vivo (por ejemplo, cambiar el plazo de 60 a 45 días o agregar autenticación). Debe reforzar autenticación y autorización, respuesta ante incidentes de seguridad, desacoplar el proveedor de modelo y contar con un modo de demostración que no dependa de la conexión al modelo.</w:t>
+        <w:t xml:space="preserve">Para una futura evaluación debería revisar y comprender el código que genera con IA antes de entregarlo, y reforzar autenticación y autorización, respuesta ante incidentes de seguridad, el desacople del proveedor de modelo y un modo de demostración que no dependa de la conexión al modelo.</w:t>
       </w:r>
     </w:p>
     <w:p>
       <w:pPr>
+        <w:pageBreakBefore/>
         <w:rPr>
           <w:rFonts w:ascii="Roboto Slab" w:eastAsia="Roboto Slab" w:hAnsi="Roboto Slab" w:cs="Roboto Slab"/>
           <w:b/>

</xml_diff>